<commit_message>
update : ajout changement de AgaMoon
</commit_message>
<xml_diff>
--- a/MoonWebsite/annexe/CdC.docx
+++ b/MoonWebsite/annexe/CdC.docx
@@ -6492,6 +6492,90 @@
           <w:p/>
         </w:tc>
       </w:tr>
+      <w:tr>
+        <w:tc>
+          <w:tcPr>
+            <w:tcW w:w="3562" w:type="dxa"/>
+            <w:gridSpan w:val="2"/>
+            <w:tcBorders>
+              <w:top w:val="single" w:sz="1" w:space="0" w:color="CCCCCC"/>
+              <w:left w:val="single" w:sz="1" w:space="0" w:color="CCCCCC"/>
+              <w:bottom w:val="single" w:sz="1" w:space="0" w:color="CCCCCC"/>
+              <w:right w:val="single" w:sz="1" w:space="0" w:color="CCCCCC"/>
+            </w:tcBorders>
+            <w:shd w:val="clear" w:color="auto" w:fill="FFFFFF" w:themeFill="background1"/>
+            <w:tcMar>
+              <w:top w:w="80" w:type="dxa"/>
+              <w:left w:w="120" w:type="dxa"/>
+              <w:bottom w:w="80" w:type="dxa"/>
+              <w:right w:w="120" w:type="dxa"/>
+            </w:tcMar>
+          </w:tcPr>
+          <w:p>
+            <w:pPr>
+              <w:pStyle w:val="TM1"/>
+              <w:tabs>
+                <w:tab w:val="right" w:leader="dot" w:pos="9060"/>
+              </w:tabs>
+            </w:pPr>
+            <w:r>
+              <w:t>Régler problème de création PWA sur mobile depuis que j’ai activé un CNAME et restructurer mon repo</w:t>
+            </w:r>
+          </w:p>
+        </w:tc>
+        <w:tc>
+          <w:tcPr>
+            <w:tcW w:w="1101" w:type="dxa"/>
+            <w:gridSpan w:val="2"/>
+            <w:tcBorders>
+              <w:top w:val="single" w:sz="1" w:space="0" w:color="CCCCCC"/>
+              <w:left w:val="single" w:sz="1" w:space="0" w:color="CCCCCC"/>
+              <w:bottom w:val="single" w:sz="1" w:space="0" w:color="CCCCCC"/>
+              <w:right w:val="single" w:sz="1" w:space="0" w:color="CCCCCC"/>
+            </w:tcBorders>
+            <w:shd w:val="clear" w:color="auto" w:fill="FFFFFF" w:themeFill="background1"/>
+            <w:tcMar>
+              <w:top w:w="80" w:type="dxa"/>
+              <w:left w:w="120" w:type="dxa"/>
+              <w:bottom w:w="80" w:type="dxa"/>
+              <w:right w:w="120" w:type="dxa"/>
+            </w:tcMar>
+          </w:tcPr>
+          <w:p>
+            <w:r>
+              <w:t xml:space="preserve">1 séquence de </w:t>
+            </w:r>
+            <w:r>
+              <w:t>6</w:t>
+            </w:r>
+            <w:r>
+              <w:t xml:space="preserve"> période</w:t>
+            </w:r>
+            <w:r>
+              <w:t xml:space="preserve"> </w:t>
+            </w:r>
+          </w:p>
+        </w:tc>
+        <w:tc>
+          <w:tcPr>
+            <w:tcW w:w="1009" w:type="dxa"/>
+            <w:tcBorders>
+              <w:top w:val="single" w:sz="1" w:space="0" w:color="CCCCCC"/>
+              <w:left w:val="single" w:sz="1" w:space="0" w:color="CCCCCC"/>
+              <w:bottom w:val="single" w:sz="1" w:space="0" w:color="CCCCCC"/>
+              <w:right w:val="single" w:sz="1" w:space="0" w:color="CCCCCC"/>
+            </w:tcBorders>
+            <w:shd w:val="clear" w:color="auto" w:fill="FFFFFF" w:themeFill="background1"/>
+            <w:tcMar>
+              <w:top w:w="80" w:type="dxa"/>
+              <w:left w:w="120" w:type="dxa"/>
+              <w:bottom w:w="80" w:type="dxa"/>
+              <w:right w:w="120" w:type="dxa"/>
+            </w:tcMar>
+          </w:tcPr>
+          <w:p/>
+        </w:tc>
+      </w:tr>
     </w:tbl>
     <w:p>
       <w:pPr>
@@ -6698,6 +6782,7 @@
       </w:pPr>
       <w:bookmarkStart w:id="18" w:name="_Toc232678051"/>
       <w:r>
+        <w:lastRenderedPageBreak/>
         <w:t>Observations &amp; Analyse</w:t>
       </w:r>
       <w:bookmarkEnd w:id="18"/>
@@ -6756,7 +6841,6 @@
     </w:p>
     <w:p>
       <w:r>
-        <w:lastRenderedPageBreak/>
         <w:t>- Bonne gestion des imprévus</w:t>
       </w:r>
     </w:p>

</xml_diff>

<commit_message>
update : màj AgaMoon
</commit_message>
<xml_diff>
--- a/MoonWebsite/annexe/CdC.docx
+++ b/MoonWebsite/annexe/CdC.docx
@@ -1587,13 +1587,13 @@
       <w:pPr>
         <w:pStyle w:val="Titre2"/>
       </w:pPr>
-      <w:bookmarkStart w:id="3" w:name="_Toc532179969"/>
-      <w:bookmarkStart w:id="4" w:name="_Toc165969639"/>
-      <w:bookmarkStart w:id="5" w:name="_Toc232678040"/>
+      <w:bookmarkStart w:id="3" w:name="_Toc232678040"/>
+      <w:bookmarkStart w:id="4" w:name="_Toc532179969"/>
+      <w:bookmarkStart w:id="5" w:name="_Toc165969639"/>
       <w:r>
         <w:t>Titre</w:t>
       </w:r>
-      <w:bookmarkEnd w:id="5"/>
+      <w:bookmarkEnd w:id="3"/>
     </w:p>
     <w:p>
       <w:pPr>
@@ -1941,8 +1941,8 @@
       <w:r>
         <w:t>Planification</w:t>
       </w:r>
-      <w:bookmarkEnd w:id="3"/>
       <w:bookmarkEnd w:id="4"/>
+      <w:bookmarkEnd w:id="5"/>
       <w:r>
         <w:t xml:space="preserve"> Initiale</w:t>
       </w:r>
@@ -5652,13 +5652,7 @@
               </w:tabs>
             </w:pPr>
             <w:r>
-              <w:t>Faire un nouveau projet</w:t>
-            </w:r>
-            <w:r>
-              <w:t> </w:t>
-            </w:r>
-            <w:r>
-              <w:t xml:space="preserve">: </w:t>
+              <w:t xml:space="preserve">Faire un nouveau projet : </w:t>
             </w:r>
             <w:hyperlink r:id="rId11" w:history="1">
               <w:r>
@@ -6096,10 +6090,7 @@
               <w:t xml:space="preserve"> période</w:t>
             </w:r>
             <w:r>
-              <w:t>s</w:t>
-            </w:r>
-            <w:r>
-              <w:t xml:space="preserve"> </w:t>
+              <w:t xml:space="preserve">s </w:t>
             </w:r>
           </w:p>
         </w:tc>
@@ -6120,7 +6111,17 @@
               <w:right w:w="120" w:type="dxa"/>
             </w:tcMar>
           </w:tcPr>
-          <w:p/>
+          <w:p>
+            <w:r>
+              <w:t>1</w:t>
+            </w:r>
+            <w:r>
+              <w:t>9</w:t>
+            </w:r>
+            <w:r>
+              <w:t>.06.26</w:t>
+            </w:r>
+          </w:p>
         </w:tc>
       </w:tr>
       <w:tr>
@@ -6204,7 +6205,17 @@
               <w:right w:w="120" w:type="dxa"/>
             </w:tcMar>
           </w:tcPr>
-          <w:p/>
+          <w:p>
+            <w:r>
+              <w:t>1</w:t>
+            </w:r>
+            <w:r>
+              <w:t>9</w:t>
+            </w:r>
+            <w:r>
+              <w:t>.06.26</w:t>
+            </w:r>
+          </w:p>
         </w:tc>
       </w:tr>
       <w:tr>
@@ -6282,6 +6293,9 @@
               <w:t xml:space="preserve"> période</w:t>
             </w:r>
             <w:r>
+              <w:t>s</w:t>
+            </w:r>
+            <w:r>
               <w:t xml:space="preserve"> </w:t>
             </w:r>
           </w:p>
@@ -6303,7 +6317,18 @@
               <w:right w:w="120" w:type="dxa"/>
             </w:tcMar>
           </w:tcPr>
-          <w:p/>
+          <w:p>
+            <w:r>
+              <w:lastRenderedPageBreak/>
+              <w:t>1</w:t>
+            </w:r>
+            <w:r>
+              <w:t>9</w:t>
+            </w:r>
+            <w:r>
+              <w:t>.06.26</w:t>
+            </w:r>
+          </w:p>
         </w:tc>
       </w:tr>
       <w:tr>
@@ -6333,25 +6358,7 @@
               </w:tabs>
             </w:pPr>
             <w:r>
-              <w:t xml:space="preserve">Créer la def calculs qui va calculer le poids sur une planete + galérer à récupérer toutes les données des autres tableaux + </w:t>
-            </w:r>
-            <w:r>
-              <w:t>hauteur saut</w:t>
-            </w:r>
-            <w:r>
-              <w:t xml:space="preserve"> + </w:t>
-            </w:r>
-            <w:r>
-              <w:t>temps de voyage</w:t>
-            </w:r>
-            <w:r>
-              <w:t xml:space="preserve"> + âge</w:t>
-            </w:r>
-            <w:r>
-              <w:t xml:space="preserve"> cosmique</w:t>
-            </w:r>
-            <w:r>
-              <w:t xml:space="preserve"> </w:t>
+              <w:t xml:space="preserve">Créer la def calculs qui va calculer le poids sur une planete + galérer à récupérer toutes les données des autres tableaux + hauteur saut + temps de voyage + âge cosmique </w:t>
             </w:r>
           </w:p>
         </w:tc>
@@ -6384,7 +6391,7 @@
               <w:t xml:space="preserve"> période</w:t>
             </w:r>
             <w:r>
-              <w:t xml:space="preserve"> </w:t>
+              <w:t>s</w:t>
             </w:r>
           </w:p>
         </w:tc>
@@ -6405,7 +6412,14 @@
               <w:right w:w="120" w:type="dxa"/>
             </w:tcMar>
           </w:tcPr>
-          <w:p/>
+          <w:p>
+            <w:r>
+              <w:t>22</w:t>
+            </w:r>
+            <w:r>
+              <w:t>.06.26</w:t>
+            </w:r>
+          </w:p>
         </w:tc>
       </w:tr>
       <w:tr>
@@ -6468,7 +6482,7 @@
               <w:t xml:space="preserve"> période</w:t>
             </w:r>
             <w:r>
-              <w:t xml:space="preserve"> </w:t>
+              <w:t>s</w:t>
             </w:r>
           </w:p>
         </w:tc>
@@ -6489,7 +6503,14 @@
               <w:right w:w="120" w:type="dxa"/>
             </w:tcMar>
           </w:tcPr>
-          <w:p/>
+          <w:p>
+            <w:r>
+              <w:t>22</w:t>
+            </w:r>
+            <w:r>
+              <w:t>.06.26</w:t>
+            </w:r>
+          </w:p>
         </w:tc>
       </w:tr>
       <w:tr>
@@ -6552,7 +6573,7 @@
               <w:t xml:space="preserve"> période</w:t>
             </w:r>
             <w:r>
-              <w:t xml:space="preserve"> </w:t>
+              <w:t>s</w:t>
             </w:r>
           </w:p>
         </w:tc>
@@ -6573,7 +6594,17 @@
               <w:right w:w="120" w:type="dxa"/>
             </w:tcMar>
           </w:tcPr>
-          <w:p/>
+          <w:p>
+            <w:r>
+              <w:t>2</w:t>
+            </w:r>
+            <w:r>
+              <w:t>3</w:t>
+            </w:r>
+            <w:r>
+              <w:t>.06.26</w:t>
+            </w:r>
+          </w:p>
         </w:tc>
       </w:tr>
     </w:tbl>
@@ -7585,7 +7616,7 @@
               <w:noProof/>
               <w:szCs w:val="16"/>
             </w:rPr>
-            <w:t>17.06.2026 13:17</w:t>
+            <w:t>22.06.2026 08:14</w:t>
           </w:r>
           <w:r>
             <w:rPr>
@@ -7797,7 +7828,7 @@
         <v:path o:extrusionok="f" gradientshapeok="t" o:connecttype="rect"/>
         <o:lock v:ext="edit" aspectratio="t"/>
       </v:shapetype>
-      <v:shape id="_x0000_i1025" type="#_x0000_t75" style="width:11.15pt;height:11.15pt" o:bullet="t">
+      <v:shape id="_x0000_i1025" type="#_x0000_t75" style="width:11.2pt;height:11.2pt" o:bullet="t">
         <v:imagedata r:id="rId1" o:title="BD10263_"/>
       </v:shape>
     </w:pict>
@@ -10149,6 +10180,7 @@
   <w:style w:type="character" w:default="1" w:styleId="Policepardfaut">
     <w:name w:val="Default Paragraph Font"/>
     <w:uiPriority w:val="1"/>
+    <w:semiHidden/>
     <w:unhideWhenUsed/>
   </w:style>
   <w:style w:type="table" w:default="1" w:styleId="TableauNormal">

</xml_diff>